<commit_message>
Freebuff: PHASE: UNIVERSAL LIVE DOCUMENT REVIEW
</commit_message>
<xml_diff>
--- a/public/templates/kala_iiibsi_hanti/beer.docx
+++ b/public/templates/kala_iiibsi_hanti/beer.docx
@@ -258,7 +258,23 @@
         <w:spacing w:after="120"/>
       </w:pPr>
       <w:r>
+        <w:t xml:space="preserve">{{IF:WAKIILO_IIBIYEYAAL}}</w:t>
+      </w:r>
+    </w:p>
+    <w:p>
+      <w:pPr>
+        <w:spacing w:after="120"/>
+      </w:pPr>
+      <w:r>
         <w:t xml:space="preserve">Wakiillo Iibiyayaasha (hal wakiil hal iibiy oo uu matalo):</w:t>
+      </w:r>
+    </w:p>
+    <w:p>
+      <w:pPr>
+        <w:spacing w:after="120"/>
+      </w:pPr>
+      <w:r>
+        <w:t xml:space="preserve">{{END:WAKIILO_IIBIYEYAAL}}</w:t>
       </w:r>
     </w:p>
     <w:p>

</xml_diff>